<commit_message>
feat: complete legal contract intelligence with generic retrieval, deterministic verification, tracked changes redlining, and comprehensive architecture docs
</commit_message>
<xml_diff>
--- a/tests/fixtures/synthetic_spike_b.docx
+++ b/tests/fixtures/synthetic_spike_b.docx
@@ -193,6 +193,19 @@
         </w:tc>
       </w:tr>
     </w:tbl>
+    <w:p>
+      <w:pPr>
+        <w:pStyle w:val="Heading1"/>
+      </w:pPr>
+      <w:r>
+        <w:t>Section 4. Term and Termination</w:t>
+      </w:r>
+    </w:p>
+    <w:p>
+      <w:r>
+        <w:t>Either party may terminate this Agreement for convenience upon thirty (30) days prior written notice to the other party.</w:t>
+      </w:r>
+    </w:p>
     <w:sectPr>
       <w:pgSz w:w="12240" w:h="15840"/>
       <w:pgMar w:top="1440" w:right="1800" w:bottom="1440" w:left="1800" w:header="720" w:footer="720" w:gutter="0"/>

</xml_diff>